<commit_message>
Final  Updated Advanced Cryptography Logbook
</commit_message>
<xml_diff>
--- a/Advanced Cryptography Logbook.docx
+++ b/Advanced Cryptography Logbook.docx
@@ -376,7 +376,25 @@
             <w:sz w:val="24"/>
             <w:szCs w:val="24"/>
           </w:rPr>
-          <w:t>https://github.com/claireobuong/advanced-cryptography</w:t>
+          <w:t>https://github.com/claireobuong/B</w:t>
+        </w:r>
+        <w:r>
+          <w:rPr>
+            <w:rStyle w:val="Hyperlink"/>
+            <w:rFonts w:ascii="Times New Roman" w:hAnsi="Times New Roman" w:cs="Times New Roman"/>
+            <w:sz w:val="24"/>
+            <w:szCs w:val="24"/>
+          </w:rPr>
+          <w:t>I</w:t>
+        </w:r>
+        <w:r>
+          <w:rPr>
+            <w:rStyle w:val="Hyperlink"/>
+            <w:rFonts w:ascii="Times New Roman" w:hAnsi="Times New Roman" w:cs="Times New Roman"/>
+            <w:sz w:val="24"/>
+            <w:szCs w:val="24"/>
+          </w:rPr>
+          <w:t>T4138-Advanced-Cryptography</w:t>
         </w:r>
       </w:hyperlink>
     </w:p>
@@ -4953,7 +4971,7 @@
           <w14:ligatures w14:val="standardContextual"/>
         </w:rPr>
         <w:drawing>
-          <wp:inline distT="0" distB="0" distL="0" distR="0" wp14:anchorId="0ABDF762" wp14:editId="1955285F">
+          <wp:inline distT="0" distB="0" distL="0" distR="0" wp14:anchorId="0ABDF762" wp14:editId="6EAF774F">
             <wp:extent cx="3232150" cy="1438237"/>
             <wp:effectExtent l="0" t="0" r="6350" b="0"/>
             <wp:docPr id="1971434408" name="Picture 10"/>
@@ -5027,7 +5045,7 @@
           <w14:ligatures w14:val="standardContextual"/>
         </w:rPr>
         <w:drawing>
-          <wp:inline distT="0" distB="0" distL="0" distR="0" wp14:anchorId="7E33800B" wp14:editId="396957AC">
+          <wp:inline distT="0" distB="0" distL="0" distR="0" wp14:anchorId="7E33800B" wp14:editId="6BEFEEF7">
             <wp:extent cx="3371370" cy="857250"/>
             <wp:effectExtent l="0" t="0" r="635" b="0"/>
             <wp:docPr id="1518703928" name="Picture 11"/>
@@ -5116,7 +5134,7 @@
           <w14:ligatures w14:val="standardContextual"/>
         </w:rPr>
         <w:drawing>
-          <wp:inline distT="0" distB="0" distL="0" distR="0" wp14:anchorId="37D4E608" wp14:editId="46C2C76C">
+          <wp:inline distT="0" distB="0" distL="0" distR="0" wp14:anchorId="37D4E608" wp14:editId="61B15AA9">
             <wp:extent cx="3459349" cy="1314450"/>
             <wp:effectExtent l="0" t="0" r="8255" b="0"/>
             <wp:docPr id="1850818031" name="Picture 12"/>
@@ -5705,7 +5723,7 @@
           <w14:ligatures w14:val="standardContextual"/>
         </w:rPr>
         <w:drawing>
-          <wp:inline distT="0" distB="0" distL="0" distR="0" wp14:anchorId="7E4F193B" wp14:editId="1BBBE8EE">
+          <wp:inline distT="0" distB="0" distL="0" distR="0" wp14:anchorId="7E4F193B" wp14:editId="3A68CDF1">
             <wp:extent cx="4054697" cy="3479800"/>
             <wp:effectExtent l="0" t="0" r="3175" b="6350"/>
             <wp:docPr id="1788446843" name="Picture 23"/>
@@ -5777,7 +5795,7 @@
           <w14:ligatures w14:val="standardContextual"/>
         </w:rPr>
         <w:drawing>
-          <wp:inline distT="0" distB="0" distL="0" distR="0" wp14:anchorId="6651F49F" wp14:editId="36A60FE1">
+          <wp:inline distT="0" distB="0" distL="0" distR="0" wp14:anchorId="6651F49F" wp14:editId="00EDB5EC">
             <wp:extent cx="3521497" cy="1822450"/>
             <wp:effectExtent l="0" t="0" r="3175" b="6350"/>
             <wp:docPr id="148947328" name="Picture 24"/>
@@ -5955,7 +5973,7 @@
           <w14:ligatures w14:val="standardContextual"/>
         </w:rPr>
         <w:drawing>
-          <wp:inline distT="0" distB="0" distL="0" distR="0" wp14:anchorId="0680A322" wp14:editId="01B4CC76">
+          <wp:inline distT="0" distB="0" distL="0" distR="0" wp14:anchorId="0680A322" wp14:editId="2C48D3AF">
             <wp:extent cx="3854085" cy="3175000"/>
             <wp:effectExtent l="0" t="0" r="0" b="6350"/>
             <wp:docPr id="1971244746" name="Picture 27"/>
@@ -6606,7 +6624,7 @@
           <w14:ligatures w14:val="standardContextual"/>
         </w:rPr>
         <w:drawing>
-          <wp:inline distT="0" distB="0" distL="0" distR="0" wp14:anchorId="11DEC1C0" wp14:editId="19AD96A3">
+          <wp:inline distT="0" distB="0" distL="0" distR="0" wp14:anchorId="11DEC1C0" wp14:editId="7BCAC086">
             <wp:extent cx="4330700" cy="1041034"/>
             <wp:effectExtent l="0" t="0" r="0" b="6985"/>
             <wp:docPr id="254003606" name="Picture 2"/>
@@ -6677,7 +6695,7 @@
           <w14:ligatures w14:val="standardContextual"/>
         </w:rPr>
         <w:drawing>
-          <wp:inline distT="0" distB="0" distL="0" distR="0" wp14:anchorId="1B6DED08" wp14:editId="23F218C9">
+          <wp:inline distT="0" distB="0" distL="0" distR="0" wp14:anchorId="1B6DED08" wp14:editId="1CD03D42">
             <wp:extent cx="4747616" cy="1162050"/>
             <wp:effectExtent l="0" t="0" r="0" b="0"/>
             <wp:docPr id="1653785400" name="Picture 6"/>
@@ -6751,7 +6769,7 @@
         </w:rPr>
         <w:lastRenderedPageBreak/>
         <w:drawing>
-          <wp:inline distT="0" distB="0" distL="0" distR="0" wp14:anchorId="04B0B779" wp14:editId="18F256A1">
+          <wp:inline distT="0" distB="0" distL="0" distR="0" wp14:anchorId="04B0B779" wp14:editId="37002D22">
             <wp:extent cx="4724400" cy="1135673"/>
             <wp:effectExtent l="0" t="0" r="0" b="7620"/>
             <wp:docPr id="892851581" name="Picture 2"/>
@@ -7021,15 +7039,7 @@
           <w:sz w:val="28"/>
           <w:szCs w:val="28"/>
         </w:rPr>
-        <w:t xml:space="preserve">6.1 </w:t>
-      </w:r>
-      <w:r>
-        <w:rPr>
-          <w:rFonts w:ascii="Times New Roman" w:hAnsi="Times New Roman" w:cs="Times New Roman"/>
-          <w:sz w:val="28"/>
-          <w:szCs w:val="28"/>
-        </w:rPr>
-        <w:t>Advanced Cryptography Toolkit: Interactive Encryption and Security Analysis System</w:t>
+        <w:t>6.1 Advanced Cryptography Toolkit: Interactive Encryption and Security Analysis System</w:t>
       </w:r>
       <w:bookmarkEnd w:id="56"/>
     </w:p>
@@ -7110,7 +7120,7 @@
           <w14:ligatures w14:val="standardContextual"/>
         </w:rPr>
         <w:drawing>
-          <wp:inline distT="0" distB="0" distL="0" distR="0" wp14:anchorId="4833AF66" wp14:editId="69C72C10">
+          <wp:inline distT="0" distB="0" distL="0" distR="0" wp14:anchorId="4833AF66" wp14:editId="4113FDE6">
             <wp:extent cx="4057397" cy="3371850"/>
             <wp:effectExtent l="0" t="0" r="635" b="0"/>
             <wp:docPr id="1318773052" name="Picture 12"/>
@@ -7181,7 +7191,7 @@
           <w14:ligatures w14:val="standardContextual"/>
         </w:rPr>
         <w:drawing>
-          <wp:inline distT="0" distB="0" distL="0" distR="0" wp14:anchorId="0BF2DB97" wp14:editId="5C3B4B5E">
+          <wp:inline distT="0" distB="0" distL="0" distR="0" wp14:anchorId="0BF2DB97" wp14:editId="460175E0">
             <wp:extent cx="3702047" cy="2876550"/>
             <wp:effectExtent l="0" t="0" r="0" b="0"/>
             <wp:docPr id="1210553552" name="Picture 13"/>
@@ -10176,6 +10186,7 @@
   <w:style w:type="character" w:default="1" w:styleId="DefaultParagraphFont">
     <w:name w:val="Default Paragraph Font"/>
     <w:uiPriority w:val="1"/>
+    <w:semiHidden/>
     <w:unhideWhenUsed/>
   </w:style>
   <w:style w:type="table" w:default="1" w:styleId="TableNormal">

</xml_diff>